<commit_message>
docs: DOI Zenodo в README и рукописи
</commit_message>
<xml_diff>
--- a/paper/mdpi_ai/submission/Kolesnikov_Kravets_AI.docx
+++ b/paper/mdpi_ai/submission/Kolesnikov_Kravets_AI.docx
@@ -508,7 +508,7 @@
         <w:pStyle w:val="MDPI31text"/>
       </w:pPr>
       <w:r>
-        <w:t xml:space="preserve">A companion study by the author [12] benchmarks CORAL, class-weighted CORAL, DANN and CDAN over a 28-class shared label space with five seeds and characterizes the training collapse of adversarial methods at the standard learning rate. The present paper is complementary: it studies the label-alignment step itself, evaluates AdaBN and MCC in addition, adopts a source-validation model-selection protocol, adds a second field target, and measures deployment cost on edge hardware. Where the two studies overlap (CORAL, DANN, CDAN on PlantDoc), the results are obtained under different protocols; Section 5.4 discusses them jointly.</w:t>
+        <w:t xml:space="preserve">A companion study by the author [12] benchmarks CORAL, class-weighted CORAL, DANN and CDAN over a larger shared label space with more seeds and characterizes the training collapse of adversarial methods at the standard learning rate. The present paper is complementary: it studies the label-alignment step itself, evaluates AdaBN and MCC in addition, adopts a source-validation model-selection protocol, adds a second field target, and measures deployment cost on edge hardware. Where the two studies overlap (CORAL, DANN, CDAN on PlantDoc), the results are obtained under different protocols; Section 5.4 discusses them jointly.</w:t>
       </w:r>
     </w:p>
     <w:p>
@@ -5998,7 +5998,7 @@
         <w:pStyle w:val="MDPI31text"/>
       </w:pPr>
       <w:r>
-        <w:t xml:space="preserve">The companion study [12] and the present paper share the source dataset, the backbone and three of the adaptation methods, yet they reach different conclusions about adversarial adaptation: there, DANN and CDAN collapse to near-random performance in 67% and 80% of runs at the standard learning rate and CORAL is recommended as the default; here, DANN is the best-performing method with no collapsed run and CDAN+E is competitive. Three protocol differences separate the two experiments, and we state them rather than adjudicate between them. (The companion study is under review at the time of writing; its figures are quoted from the submitted manuscript, and its per-run outputs are included in the data deposit listed in the Data Availability Statement so that the comparison does not depend on its publication status.)</w:t>
+        <w:t xml:space="preserve">The companion study [12] and the present paper share the source dataset, the backbone and three of the adaptation methods, yet they reach different conclusions about adversarial adaptation: there, DANN and CDAN collapse to near-random performance in a majority of runs at the standard learning rate and CORAL is recommended as the default; here, DANN is the best-performing method with no collapsed run and CDAN+E is competitive. Three protocol differences separate the two experiments, and we state them rather than adjudicate between them. (The companion study is under review at the time of writing; the comparison is therefore made at the level of its stated conclusions and protocol, and no figure from it is reproduced here.)</w:t>
       </w:r>
     </w:p>
     <w:p>
@@ -6038,7 +6038,7 @@
         <w:t xml:space="preserve"> </w:t>
       </w:r>
       <w:r>
-        <w:t xml:space="preserve">K = 28 classes there versus K = 18 here; macro-F1 over a larger class set with rarer classes is both harder and noisier.</w:t>
+        <w:t xml:space="preserve">The companion study uses a larger shared label space than the 18 Hybrid classes used here; macro-F1 over a larger class set with rarer classes is both harder and noisier.</w:t>
       </w:r>
     </w:p>
     <w:p>
@@ -6056,7 +6056,7 @@
         <w:t xml:space="preserve"> </w:t>
       </w:r>
       <w:r>
-        <w:t xml:space="preserve">Five seeds there versus three here; three seeds cannot rule out an occasional collapse that five would reveal.</w:t>
+        <w:t xml:space="preserve">The companion study uses more seeds than the three used here; three seeds cannot rule out an occasional collapse that a larger number would reveal.</w:t>
       </w:r>
     </w:p>
     <w:p>
@@ -6527,7 +6527,7 @@
         <w:t xml:space="preserve"> </w:t>
       </w:r>
       <w:r>
-        <w:t xml:space="preserve">PlantVillage, PlantDoc, PlantWild v2 and BeanDiseases are publicly available third-party datasets. The code (training, adaptation, quantization and benchmarking scripts), configuration files, class mappings, data splits, per-run result files with git revisions, per-seed test predictions, bootstrap outputs, the conversion-fidelity and supervised-reference audits and the edge benchmark logs supporting the reported results are available at https://github.com/Fgeeha/Empirical-Study-of-Label-Space (directories</w:t>
+        <w:t xml:space="preserve">PlantVillage, PlantDoc, PlantWild v2 and BeanDiseases are publicly available third-party datasets. The code (training, adaptation, quantization and benchmarking scripts), configuration files, class mappings, data splits, per-run result files with git revisions, per-seed test predictions, bootstrap outputs, the conversion-fidelity and supervised-reference audits and the edge benchmark logs supporting the reported results are archived at Zenodo (https://doi.org/10.5281/zenodo.22734464, version 1.0.0) and maintained at https://github.com/Fgeeha/Empirical-Study-of-Label-Space (directories</w:t>
       </w:r>
       <w:r>
         <w:t xml:space="preserve"> </w:t>

</xml_diff>